<commit_message>
Align student records, clue events, exports and process alerts
</commit_message>
<xml_diff>
--- a/docs/manual/LENS_Lab_评测平台完整功能逻辑与设计说明书.docx
+++ b/docs/manual/LENS_Lab_评测平台完整功能逻辑与设计说明书.docx
@@ -2037,7 +2037,7 @@
     </w:p>
     <w:p>
       <w:r>
-        <w:t>当前后台包含年龄区间与素养分层概览、任务配置、材料审查、只读会话记录、逐题分析、常用导出、完整归档和独立合成数据下载。研究者可从 /admin/preview 进入真实模型试跑。独立问卷编辑器、完整发布审批与细粒度权限仍属扩展。</w:t>
+        <w:t>当前后台包含年龄区间与素养分层概览、任务配置、材料审查、只读会话记录、逐题分析、五项常用导出与完整归档；合成来源接口供脚本核验，页面不重复列目录。研究者可从 /admin/preview 进入真实模型试跑。独立问卷编辑器、完整发布审批与细粒度权限仍属扩展。</w:t>
       </w:r>
     </w:p>
     <w:p>
@@ -3127,7 +3127,7 @@
     </w:p>
     <w:p>
       <w:r>
-        <w:t>三个年龄区间共用虚构校园共创任务 student-campus-v1，公共申请人陈禾为21岁在读本科生。四种情景将每周最多到场1／3次与此前是否获得本项目名额组合为 first_1、first_3、return_1、return_3。两项私事实分别改变登记类别和最优参加安排；它们由参与者掌握，不初始传给模型。两组在情景内比较，公共资料、选项文字与评分结构保持一致。三个人口学任务ID不代表三套独立材料。</w:t>
+        <w:t>三个年龄区间共用虚构校园共创任务 student-campus-v1，案例申请人陈禾为21岁在读本科生。四种情景将每周最多到场1／3次与此前是否获得本项目名额组合为 first_1、first_3、return_1、return_3。两项私事实分别改变登记类别和最优参加安排；它们由参与者掌握，不初始传给模型。两组在情景内比较，公共资料、选项文字与评分结构保持一致。三个人口学任务ID不代表三套独立材料。</w:t>
       </w:r>
     </w:p>
     <w:p>
@@ -6237,7 +6237,7 @@
     </w:p>
     <w:p>
       <w:r>
-        <w:t>当前后台会话记录用于只读复核，自动分析不依赖“待审核／有效／无效”等历史人工状态。人工状态、原因、操作者和时间仍保留在内部归档，兼容历史接口；它们不自动覆盖当前纳入与评分。任何剔除方案仍须由研究团队预先规定，低分、短句或负担高不是自动无效理由。</w:t>
+        <w:t>当前后台会话记录用于只读复核，自动分析不依赖“待审核／有效／无效”等历史人工状态。人工状态、原因、操作者和时间仍保留在内部归档，兼容历史接口；它们不自动覆盖当前纳入与评分。任何剔除方案仍须由研究团队预先规定，过程提醒从答案与对话派生，如“不确定作答X题”，不按组或低分造异常；提醒不自动排除，低分、短句或负担高不是无效理由。</w:t>
       </w:r>
     </w:p>
     <w:p>
@@ -6260,7 +6260,7 @@
     </w:p>
     <w:p>
       <w:r>
-        <w:t>常用记录CSV每行一次会话，中文表头；JSON为英文键。逐题答案在常用表中为1—4选项位置，归档中的原始向量从0起。独立dialogue-export JSON按会话保存消息数组，CSV按消息逐行，以record_id连接；消息原文和UTC／北京时间并存。完整归档的快照、消息、事件等以JSON字符串保存，需二次解析。常用表和对话表均保留来源、合成标记、模拟时间及正式分析资格。</w:t>
+        <w:t>页面五项常用导出为记录CSV／JSON、已完成记录CSV及对话CSV／JSON，均直接读取同一数据库。常用记录CSV每行一次会话，中文表头；JSON为英文键。逐题答案在常用表中为1—4选项位置，归档中的原始向量从0起。独立dialogue-export JSON按会话保存消息数组，CSV按消息逐行，以record_id连接；消息原文和UTC／北京时间并存。完整归档的快照、消息、事件等以JSON字符串保存，需二次解析。常用表和对话表均保留来源、合成标记、模拟时间及正式分析资格。</w:t>
       </w:r>
     </w:p>
     <w:p>
@@ -6278,17 +6278,22 @@
     </w:p>
     <w:p>
       <w:r>
-        <w:t>当前批次student-126-20261022-v1含重新生成的126条合成完成记录，三个年龄区间各42条，每区间S／A各21条，总计各63条。生成器先独立生成新版作答和决策，再用另一seed分配组别，不按目标均分或预期干预效应校准。它不是旧600条或旧126条跨年龄数据的改名、筛选或重新解释。</w:t>
+        <w:t>当前批次student-126-20261022-v2含126条合成完成记录，三个年龄区间各42条，每区间S／A各21条、总计各63条。仅前测答案和决策先生成再独立分组，不按目标均分调节；旧600条、跨年龄126条及V1不重标或复用。研究设计及学生材料版本不变。</w:t>
       </w:r>
     </w:p>
     <w:p>
       <w:r>
-        <w:t>模拟对话为人工模板，不是模型调用；时间为模拟值，真实模型延迟为空。所有记录is_synthetic为1、record_kind为synthetic、data_origin为synthetic、platform_analysis_eligible为0。展示统计可使用showcase_analysis_eligible=true，但正式analysis_eligible=false。展示站kind=analysis可能仍返回126条可计算记录，不能只看接口名判断是否是真实样本；记录表和对话表明确携带来源与资格标记。</w:t>
+        <w:t>人工对话另预设A组先两轮各问一个必要事实（既往名额、每周到场），补齐后继续原问题并给5张线索；S组用户主动补齐两事实后取得3张。两组分别8轮和5轮，总线索315／189条，每个evidence_reveal对应实际模板正文。线索差是人工展示假设，不是实测干预效应。</w:t>
       </w:r>
     </w:p>
     <w:p>
       <w:r>
-        <w:t>独立下载清单为/api/admin/synthetic-datasets，下载参数file支持csv、json、readme、materials_json、manifest_json、zip，提供逐人模拟记录、冻结材料、生成清单和说明。旧跨年龄库和原600条来源包另行归档，当前下载不暴露为新版学生数据。普通demo也可能保存可计算的完成记录，因此即使某处analysis_eligible=true，仍须核对run_mode、record_kind及is_synthetic，不能把规则演示当作真实模型实验。合成分差、模拟时长和题项分布不能充当招募结果、信效度证据或干预效应。</w:t>
+        <w:t>对话不是实际模型输出，任务时点为模拟值；前测耗时和实测模型延迟为空。is_synthetic=1、record_kind及data_origin为synthetic，platform_analysis_eligible=0；展示可计算showcase_analysis_eligible=true，正式analysis_eligible=false。kind=analysis可返回展示记录，不能凭接口名当作真实样本；导出保留来源及资格标记。</w:t>
+      </w:r>
+    </w:p>
+    <w:p>
+      <w:r>
+        <w:t>来源接口/api/admin/synthetic-datasets及synthetic-export保留冻结材料、manifest与说明供核验；页面五项下载直接读V2库，不重复列来源目录。manifest记录evidence_policy_is_simulated_assumption=true及每条S3／A5卡。模拟分差、时长和题项分布均不是招募、信效度或干预证据；普通demo也须按模式与来源单独解释。</w:t>
       </w:r>
     </w:p>
     <w:p>
@@ -7075,7 +7080,7 @@
     </w:p>
     <w:p>
       <w:r>
-        <w:t>原始时点采用带时区UTC秒级时间戳，后台显示北京时间；前测未埋点，pretest_time_seconds为空。当前真实模型不生成evidence_reveal逐卡揭示事件，不能以事件为0判断模型未利用参考资料。澄清动作依赖模型输出标记，两组都可能漏标或误标，须离线核查原文。未完成记录的结束时间、完成时长及分数为空。两组按统一观察窗口或截止规则判定完成，仍在进行的会话不能直接算作未完成。不能把缺失值填零后比较平均完成时间；只分析完成者也可能受退出差异影响，应同时报告各组流失与原因。</w:t>
+        <w:t>原始时点采用带时区UTC秒级时间戳，后台显示北京时间；前测未埋点，pretest_time_seconds及synthetic_pretest_time_seconds均为空，不补造前测时长。当前真实模型不生成evidence_reveal逐卡揭示事件，不能以事件为0判断模型未利用参考资料。澄清动作依赖模型输出标记，两组都可能漏标或误标，须离线核查原文。未完成记录的结束时间、完成时长及分数为空。两组按统一观察窗口或截止规则判定完成，仍在进行的会话不能直接算作未完成。不能把缺失值填零后比较平均完成时间；只分析完成者也可能受退出差异影响，应同时报告各组流失与原因。</w:t>
       </w:r>
     </w:p>
     <w:p>
@@ -8966,7 +8971,7 @@
     </w:p>
     <w:p>
       <w:r>
-        <w:t>旧data/lens.sqlite3及showcase-data/showcase.sqlite3已保留历史，不回填大学生身份，不重写旧答案和对话。切换前做一致性备份并保存记录摘要，切换后核对旧库未变。新真实试跑和合成展示使用不同库；研究者试跑record_kind=researcher_preview，不进入普通participant分析。live模式会自动准备带独立-live标识的学生候选任务，正式招募前仍须审查和冻结；若要正式招募，须配置live、真实模型和参与口令，并完成研究准备，不能把现有管理员试跑入口直接当作正式收集入口。</w:t>
+        <w:t>旧data、showcase-data、600条来源、V1及临时库先做一致性备份并转存服务器外私有位置，核验后从服务器移除；旧答案和对话不重写。V2使用全新展示库，不复用V1收据。服务器仅保留两个当前学生数据目录，Compose不再挂载synthetic-datasets。新真实试跑和合成展示使用不同库；研究者试跑record_kind=researcher_preview，不进入普通participant分析。live模式会自动准备带独立-live标识的学生候选任务，正式招募前仍须审查和冻结；若要正式招募，须配置live、真实模型和参与口令，并完成研究准备，不能把现有管理员试跑入口直接当作正式收集入口。</w:t>
       </w:r>
     </w:p>
     <w:p>
@@ -8996,7 +9001,7 @@
     </w:p>
     <w:p>
       <w:r>
-        <w:t>后台网页登录使用有期限的HttpOnly Cookie；脚本仍可用HTTP Basic，二者不意味着已经提供多角色权限。HTTPS与随机管理员凭证由部署者维护，密钥留在后端环境配置，不写入网页、公开仓库或常用导出。敏感后台响应禁止缓存，后台浏览器写请求执行同源检查，Basic脚本保持兼容。限速、细粒度授权和独立操作审计仍需按投放规模补强。</w:t>
+        <w:t>后台网页登录使用有期限的HttpOnly Cookie；脚本仍可用HTTP Basic，二者不意味着已经提供多角色权限。HTTPS与随机管理员凭证由部署者维护，真实密钥留在私有后端.env，公开模板MODEL_API_KEY仅为“自行填写API”，不写入网页或常用导出。敏感后台响应禁止缓存，后台浏览器写请求执行同源检查，Basic脚本保持兼容。限速、细粒度授权和独立操作审计仍需按投放规模补强。</w:t>
       </w:r>
     </w:p>
     <w:p>
@@ -9006,7 +9011,7 @@
     </w:p>
     <w:p>
       <w:r>
-        <w:t>API 密钥、数据库、原始对话及真实研究导出不进入公开代码仓库。公开演示使用明确标注的模拟案例；公开研究数据前开展脱敏和再识别检查。向模型服务发送的数据仅限当前任务所需，不包含前测能力标签、凭证或未授权资料。</w:t>
+        <w:t>API 密钥、数据库、原始对话及真实研究导出不进入公开代码仓库。公开演示仅使用合成案例，下载及机器来源元数据保留合成标记；公开研究数据前开展脱敏和再识别检查。向模型服务发送的数据仅限当前任务所需，不包含前测能力标签、凭证或未授权资料。</w:t>
       </w:r>
     </w:p>
     <w:p>
@@ -13584,7 +13589,7 @@
                 <w:color w:val="000000"/>
                 <w:sz w:val="18"/>
               </w:rPr>
-              <w:t>无起点埋点 当前为空</w:t>
+              <w:t>无起点埋点 真实与合成前测耗时均为空</w:t>
             </w:r>
           </w:p>
         </w:tc>
@@ -14240,7 +14245,7 @@
                 <w:color w:val="000000"/>
                 <w:sz w:val="18"/>
               </w:rPr>
-              <w:t>review_status 与 review_reason</w:t>
+              <w:t>process_alert_details_json 与 flags_json</w:t>
             </w:r>
           </w:p>
         </w:tc>
@@ -14268,7 +14273,7 @@
                 <w:color w:val="000000"/>
                 <w:sz w:val="18"/>
               </w:rPr>
-              <w:t>审核状态与原因 review_code 为原因码</w:t>
+              <w:t>按答案和对话派生的提醒与代码</w:t>
             </w:r>
           </w:p>
         </w:tc>
@@ -14296,7 +14301,7 @@
                 <w:color w:val="000000"/>
                 <w:sz w:val="18"/>
               </w:rPr>
-              <w:t>不覆盖原始结局</w:t>
+              <w:t>不按低分或组别造异常 不自动排除</w:t>
             </w:r>
           </w:p>
         </w:tc>
@@ -14329,7 +14334,7 @@
                 <w:color w:val="000000"/>
                 <w:sz w:val="18"/>
               </w:rPr>
-              <w:t>review_history_json</w:t>
+              <w:t>review_status 与 review_reason</w:t>
             </w:r>
           </w:p>
         </w:tc>
@@ -14357,7 +14362,7 @@
                 <w:color w:val="000000"/>
                 <w:sz w:val="18"/>
               </w:rPr>
-              <w:t>审核修改历史的 JSON 编码字符串</w:t>
+              <w:t>审核状态与原因 review_code 为原因码</w:t>
             </w:r>
           </w:p>
         </w:tc>
@@ -14385,7 +14390,7 @@
                 <w:color w:val="000000"/>
                 <w:sz w:val="18"/>
               </w:rPr>
-              <w:t>保留操作者及时间</w:t>
+              <w:t>不覆盖原始结局</w:t>
             </w:r>
           </w:p>
         </w:tc>
@@ -14418,7 +14423,7 @@
                 <w:color w:val="000000"/>
                 <w:sz w:val="18"/>
               </w:rPr>
-              <w:t>consent_version 建议新增</w:t>
+              <w:t>review_history_json</w:t>
             </w:r>
           </w:p>
         </w:tc>
@@ -14446,7 +14451,7 @@
                 <w:color w:val="000000"/>
                 <w:sz w:val="18"/>
               </w:rPr>
-              <w:t>同意材料版本及确认时间</w:t>
+              <w:t>审核修改历史的 JSON 编码字符串</w:t>
             </w:r>
           </w:p>
         </w:tc>
@@ -14474,7 +14479,7 @@
                 <w:color w:val="000000"/>
                 <w:sz w:val="18"/>
               </w:rPr>
-              <w:t>不保存不必要身份信息</w:t>
+              <w:t>保留操作者及时间</w:t>
             </w:r>
           </w:p>
         </w:tc>
@@ -14507,7 +14512,7 @@
                 <w:color w:val="000000"/>
                 <w:sz w:val="18"/>
               </w:rPr>
-              <w:t>request_id</w:t>
+              <w:t>consent_version 建议新增</w:t>
             </w:r>
           </w:p>
         </w:tc>
@@ -14535,7 +14540,7 @@
                 <w:color w:val="000000"/>
                 <w:sz w:val="18"/>
               </w:rPr>
-              <w:t>开始及消息请求去重标识</w:t>
+              <w:t>同意材料版本及确认时间</w:t>
             </w:r>
           </w:p>
         </w:tc>
@@ -14563,7 +14568,7 @@
                 <w:color w:val="000000"/>
                 <w:sz w:val="18"/>
               </w:rPr>
-              <w:t>已实现 归档可查请求状态 不复用不同载荷</w:t>
+              <w:t>不保存不必要身份信息</w:t>
             </w:r>
           </w:p>
         </w:tc>
@@ -14596,7 +14601,7 @@
                 <w:color w:val="000000"/>
                 <w:sz w:val="18"/>
               </w:rPr>
-              <w:t>release_id 建议新增</w:t>
+              <w:t>request_id</w:t>
             </w:r>
           </w:p>
         </w:tc>
@@ -14624,6 +14629,95 @@
                 <w:color w:val="000000"/>
                 <w:sz w:val="18"/>
               </w:rPr>
+              <w:t>开始及消息请求去重标识</w:t>
+            </w:r>
+          </w:p>
+        </w:tc>
+        <w:tc>
+          <w:tcPr>
+            <w:tcW w:type="dxa" w:w="3288"/>
+            <w:vAlign w:val="center"/>
+            <w:tcMar>
+              <w:top w:w="85" w:type="dxa"/>
+              <w:bottom w:w="85" w:type="dxa"/>
+              <w:left w:w="110" w:type="dxa"/>
+              <w:right w:w="110" w:type="dxa"/>
+            </w:tcMar>
+            <w:shd w:fill="FFFFFF"/>
+          </w:tcPr>
+          <w:p>
+            <w:pPr>
+              <w:keepNext w:val="0"/>
+              <w:spacing w:after="0" w:before="0" w:line="271" w:lineRule="auto"/>
+            </w:pPr>
+            <w:r>
+              <w:rPr>
+                <w:rFonts w:ascii="Arial" w:hAnsi="Arial" w:eastAsia="Songti SC"/>
+                <w:b w:val="0"/>
+                <w:color w:val="000000"/>
+                <w:sz w:val="18"/>
+              </w:rPr>
+              <w:t>已实现 归档可查请求状态 不复用不同载荷</w:t>
+            </w:r>
+          </w:p>
+        </w:tc>
+      </w:tr>
+      <w:tr>
+        <w:trPr>
+          <w:cantSplit/>
+        </w:trPr>
+        <w:tc>
+          <w:tcPr>
+            <w:tcW w:type="dxa" w:w="2835"/>
+            <w:vAlign w:val="center"/>
+            <w:tcMar>
+              <w:top w:w="85" w:type="dxa"/>
+              <w:bottom w:w="85" w:type="dxa"/>
+              <w:left w:w="110" w:type="dxa"/>
+              <w:right w:w="110" w:type="dxa"/>
+            </w:tcMar>
+            <w:shd w:fill="F8FAFC"/>
+          </w:tcPr>
+          <w:p>
+            <w:pPr>
+              <w:keepNext w:val="0"/>
+              <w:spacing w:after="0" w:before="0" w:line="271" w:lineRule="auto"/>
+            </w:pPr>
+            <w:r>
+              <w:rPr>
+                <w:rFonts w:ascii="Arial" w:hAnsi="Arial" w:eastAsia="Songti SC"/>
+                <w:b w:val="0"/>
+                <w:color w:val="000000"/>
+                <w:sz w:val="18"/>
+              </w:rPr>
+              <w:t>release_id 建议新增</w:t>
+            </w:r>
+          </w:p>
+        </w:tc>
+        <w:tc>
+          <w:tcPr>
+            <w:tcW w:type="dxa" w:w="3118"/>
+            <w:vAlign w:val="center"/>
+            <w:tcMar>
+              <w:top w:w="85" w:type="dxa"/>
+              <w:bottom w:w="85" w:type="dxa"/>
+              <w:left w:w="110" w:type="dxa"/>
+              <w:right w:w="110" w:type="dxa"/>
+            </w:tcMar>
+            <w:shd w:fill="F8FAFC"/>
+          </w:tcPr>
+          <w:p>
+            <w:pPr>
+              <w:keepNext w:val="0"/>
+              <w:spacing w:after="0" w:before="0" w:line="271" w:lineRule="auto"/>
+            </w:pPr>
+            <w:r>
+              <w:rPr>
+                <w:rFonts w:ascii="Arial" w:hAnsi="Arial" w:eastAsia="Songti SC"/>
+                <w:b w:val="0"/>
+                <w:color w:val="000000"/>
+                <w:sz w:val="18"/>
+              </w:rPr>
               <w:t>完整冻结发布清单标识</w:t>
             </w:r>
           </w:p>
@@ -14638,7 +14732,7 @@
               <w:left w:w="110" w:type="dxa"/>
               <w:right w:w="110" w:type="dxa"/>
             </w:tcMar>
-            <w:shd w:fill="FFFFFF"/>
+            <w:shd w:fill="F8FAFC"/>
           </w:tcPr>
           <w:p>
             <w:pPr>

</xml_diff>

<commit_message>
Vary dialogue paths and simplify routine CSV exports
</commit_message>
<xml_diff>
--- a/docs/manual/LENS_Lab_评测平台完整功能逻辑与设计说明书.docx
+++ b/docs/manual/LENS_Lab_评测平台完整功能逻辑与设计说明书.docx
@@ -653,7 +653,7 @@
           <w:sz w:val="22"/>
         </w:rPr>
         <w:tab/>
-        <w:t>30</w:t>
+        <w:t>31</w:t>
       </w:r>
     </w:p>
     <w:p>
@@ -680,7 +680,7 @@
           <w:sz w:val="22"/>
         </w:rPr>
         <w:tab/>
-        <w:t>31</w:t>
+        <w:t>32</w:t>
       </w:r>
     </w:p>
     <w:p>
@@ -6260,7 +6260,7 @@
     </w:p>
     <w:p>
       <w:r>
-        <w:t>页面五项常用导出为记录CSV／JSON、已完成记录CSV及对话CSV／JSON，均直接读取同一数据库。常用记录CSV每行一次会话，中文表头；JSON为英文键。逐题答案在常用表中为1—4选项位置，归档中的原始向量从0起。独立dialogue-export JSON按会话保存消息数组，CSV按消息逐行，以record_id连接；消息原文和UTC／北京时间并存。完整归档的快照、消息、事件等以JSON字符串保存，需二次解析。常用表和对话表均保留来源、合成标记、模拟时间及正式分析资格。</w:t>
+        <w:t>页面五项常用导出为记录CSV／JSON、已完成记录CSV及对话CSV／JSON，均直接读取同一数据库。常用记录CSV每行一次会话，中文表头；JSON为英文键。逐题答案在常用表中为1—4选项位置，归档中的原始向量从0起。独立dialogue-export JSON按会话保存消息数组，CSV按消息逐行，以record_id连接；消息原文和UTC／北京时间并存。完整归档的快照、消息、事件等以JSON字符串保存，需二次解析。三类常用CSV仅留业务列，省略来源和内部分析资格；常用JSON及完整归档保留来源、时间标记及资格。</w:t>
       </w:r>
     </w:p>
     <w:p>
@@ -6278,22 +6278,22 @@
     </w:p>
     <w:p>
       <w:r>
-        <w:t>当前批次student-126-20261022-v2含126条合成完成记录，三个年龄区间各42条，每区间S／A各21条、总计各63条。仅前测答案和决策先生成再独立分组，不按目标均分调节；旧600条、跨年龄126条及V1不重标或复用。研究设计及学生材料版本不变。</w:t>
+        <w:t>当前批次student-126-20261022-v3含126条完成记录，三个年龄区间各42条、S／A各63条。保留V2前测、决策、人口属性、分组、情景和模拟起止时点，沿用个人随机键，只重编人工对话，不按均分调分。旧600条、跨年龄资料及V1不重标；研究设计和学生材料版本不变。</w:t>
       </w:r>
     </w:p>
     <w:p>
       <w:r>
-        <w:t>人工对话另预设A组先两轮各问一个必要事实（既往名额、每周到场），补齐后继续原问题并给5张线索；S组用户主动补齐两事实后取得3张。两组分别8轮和5轮，总线索315／189条，每个evidence_reveal对应实际模板正文。线索差是人工展示假设，不是实测干预效应。</w:t>
+        <w:t>人工过程预设逐条A2–8次、S1–5次来源，范围重叠；每卡最多两次且不连续，允许间隔复核，年龄兴趣权重不同。初始可给无、一项或两项事实；A只问未给事实0–2次，补齐即继续回答，S不主动问。实际A3–10轮、S2–8轮，总线索308／195次，每次事件对应模板正文。这是展示假设，不是实测效应。</w:t>
       </w:r>
     </w:p>
     <w:p>
       <w:r>
-        <w:t>对话不是实际模型输出，任务时点为模拟值；前测耗时和实测模型延迟为空。is_synthetic=1、record_kind及data_origin为synthetic，platform_analysis_eligible=0；展示可计算showcase_analysis_eligible=true，正式analysis_eligible=false。kind=analysis可返回展示记录，不能凭接口名当作真实样本；导出保留来源及资格标记。</w:t>
+        <w:t>未调用模型，前测耗时和实测延迟为空；JSON及归档保留is_synthetic、data_origin、时间标记及正式分析资格0，三类CSV只留业务列。kind=analysis可返回可计算展示记录，不能凭接口名当作真实样本。</w:t>
       </w:r>
     </w:p>
     <w:p>
       <w:r>
-        <w:t>来源接口/api/admin/synthetic-datasets及synthetic-export保留冻结材料、manifest与说明供核验；页面五项下载直接读V2库，不重复列来源目录。manifest记录evidence_policy_is_simulated_assumption=true及每条S3／A5卡。模拟分差、时长和题项分布均不是招募、信效度或干预证据；普通demo也须按模式与来源单独解释。</w:t>
+        <w:t>来源接口保留冻结材料、manifest、父批次及个人指纹供复核；五项下载读取同一V3库，不重复列来源目录。manifest如实保存逐条过程规则与人工假设，不再固定S3／A5卡。分差、时长和题项分布不构成招募、信效度或干预证据；普通demo仍按模式与来源单独解释。</w:t>
       </w:r>
     </w:p>
     <w:p>
@@ -8971,7 +8971,7 @@
     </w:p>
     <w:p>
       <w:r>
-        <w:t>旧data、showcase-data、600条来源、V1及临时库先做一致性备份并转存服务器外私有位置，核验后从服务器移除；旧答案和对话不重写。V2使用全新展示库，不复用V1收据。服务器仅保留两个当前学生数据目录，Compose不再挂载synthetic-datasets。新真实试跑和合成展示使用不同库；研究者试跑record_kind=researcher_preview，不进入普通participant分析。live模式会自动准备带独立-live标识的学生候选任务，正式招募前仍须审查和冻结；若要正式招募，须配置live、真实模型和参与口令，并完成研究准备，不能把现有管理员试跑入口直接当作正式收集入口。</w:t>
+        <w:t>旧data、showcase-data、600条来源、V1、V2及临时库先做一致性备份并转存服务器外私有位置，核验后从服务器移除；旧答案和对话不重写。V3使用新展示库与新批次收据，保留V2个人业务数据，旧收据不复用。服务器仅保留两个当前学生数据目录，Compose不再挂载synthetic-datasets。新真实试跑和合成展示使用不同库；研究者试跑record_kind=researcher_preview，不进入普通participant分析。live模式会自动准备带独立-live标识的学生候选任务，正式招募前仍须审查和冻结；若要正式招募，须配置live、真实模型和参与口令，并完成研究准备，不能把现有管理员试跑入口直接当作正式收集入口。</w:t>
       </w:r>
     </w:p>
     <w:p>
@@ -9011,7 +9011,7 @@
     </w:p>
     <w:p>
       <w:r>
-        <w:t>API 密钥、数据库、原始对话及真实研究导出不进入公开代码仓库。公开演示仅使用合成案例，下载及机器来源元数据保留合成标记；公开研究数据前开展脱敏和再识别检查。向模型服务发送的数据仅限当前任务所需，不包含前测能力标签、凭证或未授权资料。</w:t>
+        <w:t>API 密钥、数据库、原始对话及真实研究导出不进入公开代码仓库。公开演示仅使用合成案例，常用JSON及完整归档保留来源标记，三类常用CSV仅含业务列；公开研究数据前开展脱敏和再识别检查。向模型服务发送的数据仅限当前任务所需，不包含前测能力标签、凭证或未授权资料。</w:t>
       </w:r>
     </w:p>
     <w:p>
@@ -11078,7 +11078,7 @@
     </w:p>
     <w:p>
       <w:r>
-        <w:t>下表区分常用精简表、完整归档与建议新增字段。常用CSV采用中文表头、JSON采用英文键，以当前schema为准；内部凭证、完整来源及快照只在认证归档中提供。</w:t>
+        <w:t>下表区分常用精简表、完整归档与建议新增字段。常用CSV采用中文表头、JSON采用英文键，以当前schema为准；内部凭证及快照仅在认证归档提供，来源与资格见常用JSON及归档，三类CSV省略这些列。</w:t>
       </w:r>
     </w:p>
     <w:tbl>
@@ -11453,7 +11453,7 @@
                 <w:color w:val="000000"/>
                 <w:sz w:val="18"/>
               </w:rPr>
-              <w:t>真实参与 试跑 合成分开</w:t>
+              <w:t>仅JSON及归档 真实参与 试跑 合成分开</w:t>
             </w:r>
           </w:p>
         </w:tc>
@@ -11542,7 +11542,7 @@
                 <w:color w:val="000000"/>
                 <w:sz w:val="18"/>
               </w:rPr>
-              <w:t>不得因精简导出而丢失</w:t>
+              <w:t>JSON及归档保留 常用CSV不含</w:t>
             </w:r>
           </w:p>
         </w:tc>
@@ -11631,7 +11631,7 @@
                 <w:color w:val="000000"/>
                 <w:sz w:val="18"/>
               </w:rPr>
-              <w:t>合成固定为false／0</w:t>
+              <w:t>合成固定false／0 常用CSV不含</w:t>
             </w:r>
           </w:p>
         </w:tc>
@@ -11720,7 +11720,7 @@
                 <w:color w:val="000000"/>
                 <w:sz w:val="18"/>
               </w:rPr>
-              <w:t>不能代替正式分析资格</w:t>
+              <w:t>仅JSON及归档 不能代替正式资格</w:t>
             </w:r>
           </w:p>
         </w:tc>
@@ -14768,6 +14768,7 @@
       <w:bookmarkStart w:id="21" w:name="chapter_21"/>
       <w:pPr>
         <w:pStyle w:val="Heading1"/>
+        <w:pageBreakBefore/>
       </w:pPr>
       <w:r>
         <w:t>附录二 等义表达评测模块扩展规格</w:t>

</xml_diff>

<commit_message>
Populate reply time estimates with traceable timing metadata
</commit_message>
<xml_diff>
--- a/docs/manual/LENS_Lab_评测平台完整功能逻辑与设计说明书.docx
+++ b/docs/manual/LENS_Lab_评测平台完整功能逻辑与设计说明书.docx
@@ -410,7 +410,7 @@
           <w:sz w:val="22"/>
         </w:rPr>
         <w:tab/>
-        <w:t>19</w:t>
+        <w:t>20</w:t>
       </w:r>
     </w:p>
     <w:p>
@@ -518,7 +518,7 @@
           <w:sz w:val="22"/>
         </w:rPr>
         <w:tab/>
-        <w:t>24</w:t>
+        <w:t>25</w:t>
       </w:r>
     </w:p>
     <w:p>
@@ -6278,7 +6278,7 @@
     </w:p>
     <w:p>
       <w:r>
-        <w:t>当前批次student-126-20261022-v3含126条完成记录，三个年龄区间各42条、S／A各63条。保留V2前测、决策、人口属性、分组、情景和模拟起止时点，沿用个人随机键，只重编人工对话，不按均分调分。旧600条、跨年龄资料及V1不重标；研究设计和学生材料版本不变。</w:t>
+        <w:t>当前批次student-126-20261022-v4含126条完成记录，三个年龄区间各42条、S／A各63条。沿用V3的前测、决策、背景、分组、情景、对话正文、动作和模拟时点，仅增加逐轮耗时估计，不按均分调分。旧600条、跨年龄资料及V1不重标；研究设计和学生材料版本不变。</w:t>
       </w:r>
     </w:p>
     <w:p>
@@ -6288,12 +6288,12 @@
     </w:p>
     <w:p>
       <w:r>
-        <w:t>未调用模型，前测耗时和实测延迟为空；JSON及归档保留is_synthetic、data_origin、时间标记及正式分析资格0，三类CSV只留业务列。kind=analysis可返回可计算展示记录，不能凭接口名当作真实样本。</w:t>
+        <w:t>未调用模型。AI平均用时按回复长度、动作类型及固定seed逐轮估算，766次为0.674–6.405秒，按回复数加权平均2.86秒，各会话均值1.94–4.02秒；估计不作性能评测。前测耗时与实际模型延迟仍为空；JSON及归档保留is_synthetic、data_origin、时间标记及正式分析资格0，三类CSV只留业务列。kind=analysis可返回可计算展示记录，不能凭接口名当作真实样本。</w:t>
       </w:r>
     </w:p>
     <w:p>
       <w:r>
-        <w:t>来源接口保留冻结材料、manifest、父批次及个人指纹供复核；五项下载读取同一V3库，不重复列来源目录。manifest如实保存逐条过程规则与人工假设，不再固定S3／A5卡。分差、时长和题项分布不构成招募、信效度或干预证据；普通demo仍按模式与来源单独解释。</w:t>
+        <w:t>来源接口保留冻结材料、manifest、父批次及个人指纹供复核；五项下载读取同一V4库，不重复列来源目录。manifest如实保存逐条过程规则与人工假设，不再固定S3／A5卡。分差、时长和题项分布不构成招募、信效度或干预证据；普通demo仍按模式与来源单独解释。</w:t>
       </w:r>
     </w:p>
     <w:p>
@@ -6826,7 +6826,7 @@
                 <w:color w:val="000000"/>
                 <w:sz w:val="18"/>
               </w:rPr>
-              <w:t>回复延迟</w:t>
+              <w:t>AI平均用时</w:t>
             </w:r>
           </w:p>
         </w:tc>
@@ -6854,7 +6854,7 @@
                 <w:color w:val="000000"/>
                 <w:sz w:val="18"/>
               </w:rPr>
-              <w:t>服务端单轮回复处理耗时</w:t>
+              <w:t>会话内有效回复耗时的平均秒数</w:t>
             </w:r>
           </w:p>
         </w:tc>
@@ -6882,7 +6882,7 @@
                 <w:color w:val="000000"/>
                 <w:sz w:val="18"/>
               </w:rPr>
-              <w:t>非纯推理耗时 模拟记录真实延迟为空</w:t>
+              <w:t>真实取实测 展示取估计 不能混作性能评测</w:t>
             </w:r>
           </w:p>
         </w:tc>
@@ -7076,6 +7076,11 @@
           <w:color w:val="000000"/>
           <w:sz w:val="8"/>
         </w:rPr>
+      </w:r>
+    </w:p>
+    <w:p>
+      <w:r>
+        <w:t>V4展示按动作基础耗时、回复字数及固定随机波动估算，保存reply_time_estimate事件和估计器student-reply-time-estimator-v1。记录JSON保存reply_time_source=estimated、样本数和估计器版本，完整归档可查逐轮依据；CSV省略这三个机器字段，70个业务列不变，对话JSON不增平均时间字段。实际模型延迟为空，不生成reply_latency实测事件。汇总按回复数加权，每会话有实测时优先实测；真实记录无日志留空。</w:t>
       </w:r>
     </w:p>
     <w:p>
@@ -8971,7 +8976,7 @@
     </w:p>
     <w:p>
       <w:r>
-        <w:t>旧data、showcase-data、600条来源、V1、V2及临时库先做一致性备份并转存服务器外私有位置，核验后从服务器移除；旧答案和对话不重写。V3使用新展示库与新批次收据，保留V2个人业务数据，旧收据不复用。服务器仅保留两个当前学生数据目录，Compose不再挂载synthetic-datasets。新真实试跑和合成展示使用不同库；研究者试跑record_kind=researcher_preview，不进入普通participant分析。live模式会自动准备带独立-live标识的学生候选任务，正式招募前仍须审查和冻结；若要正式招募，须配置live、真实模型和参与口令，并完成研究准备，不能把现有管理员试跑入口直接当作正式收集入口。</w:t>
+        <w:t>旧data、showcase-data、600条来源、V1、V2、V3及临时库先做一致性备份并转存服务器外私有位置，核验后从服务器移除；旧答案和对话不重写。V4使用新展示库与新批次收据，沿用V3个人数据和对话过程，旧收据不复用。服务器仅保留两个当前学生数据目录，Compose不再挂载synthetic-datasets。新真实试跑和合成展示使用不同库；研究者试跑record_kind=researcher_preview，不进入普通participant分析。live模式会自动准备带独立-live标识的学生候选任务，正式招募前仍须审查和冻结；若要正式招募，须配置live、真实模型和参与口令，并完成研究准备，不能把现有管理员试跑入口直接当作正式收集入口。</w:t>
       </w:r>
     </w:p>
     <w:p>
@@ -13590,6 +13595,184 @@
                 <w:sz w:val="18"/>
               </w:rPr>
               <w:t>无起点埋点 真实与合成前测耗时均为空</w:t>
+            </w:r>
+          </w:p>
+        </w:tc>
+      </w:tr>
+      <w:tr>
+        <w:trPr>
+          <w:cantSplit/>
+        </w:trPr>
+        <w:tc>
+          <w:tcPr>
+            <w:tcW w:type="dxa" w:w="2835"/>
+            <w:vAlign w:val="center"/>
+            <w:tcMar>
+              <w:top w:w="85" w:type="dxa"/>
+              <w:bottom w:w="85" w:type="dxa"/>
+              <w:left w:w="110" w:type="dxa"/>
+              <w:right w:w="110" w:type="dxa"/>
+            </w:tcMar>
+            <w:shd w:fill="F8FAFC"/>
+          </w:tcPr>
+          <w:p>
+            <w:pPr>
+              <w:keepNext w:val="0"/>
+              <w:spacing w:after="0" w:before="0" w:line="271" w:lineRule="auto"/>
+            </w:pPr>
+            <w:r>
+              <w:rPr>
+                <w:rFonts w:ascii="Arial" w:hAnsi="Arial" w:eastAsia="Songti SC"/>
+                <w:b w:val="0"/>
+                <w:color w:val="000000"/>
+                <w:sz w:val="18"/>
+              </w:rPr>
+              <w:t>mean_reply_seconds</w:t>
+            </w:r>
+          </w:p>
+        </w:tc>
+        <w:tc>
+          <w:tcPr>
+            <w:tcW w:type="dxa" w:w="3118"/>
+            <w:vAlign w:val="center"/>
+            <w:tcMar>
+              <w:top w:w="85" w:type="dxa"/>
+              <w:bottom w:w="85" w:type="dxa"/>
+              <w:left w:w="110" w:type="dxa"/>
+              <w:right w:w="110" w:type="dxa"/>
+            </w:tcMar>
+            <w:shd w:fill="F8FAFC"/>
+          </w:tcPr>
+          <w:p>
+            <w:pPr>
+              <w:keepNext w:val="0"/>
+              <w:spacing w:after="0" w:before="0" w:line="271" w:lineRule="auto"/>
+            </w:pPr>
+            <w:r>
+              <w:rPr>
+                <w:rFonts w:ascii="Arial" w:hAnsi="Arial" w:eastAsia="Songti SC"/>
+                <w:b w:val="0"/>
+                <w:color w:val="000000"/>
+                <w:sz w:val="18"/>
+              </w:rPr>
+              <w:t>会话内AI平均回复秒数</w:t>
+            </w:r>
+          </w:p>
+        </w:tc>
+        <w:tc>
+          <w:tcPr>
+            <w:tcW w:type="dxa" w:w="3288"/>
+            <w:vAlign w:val="center"/>
+            <w:tcMar>
+              <w:top w:w="85" w:type="dxa"/>
+              <w:bottom w:w="85" w:type="dxa"/>
+              <w:left w:w="110" w:type="dxa"/>
+              <w:right w:w="110" w:type="dxa"/>
+            </w:tcMar>
+            <w:shd w:fill="F8FAFC"/>
+          </w:tcPr>
+          <w:p>
+            <w:pPr>
+              <w:keepNext w:val="0"/>
+              <w:spacing w:after="0" w:before="0" w:line="271" w:lineRule="auto"/>
+            </w:pPr>
+            <w:r>
+              <w:rPr>
+                <w:rFonts w:ascii="Arial" w:hAnsi="Arial" w:eastAsia="Songti SC"/>
+                <w:b w:val="0"/>
+                <w:color w:val="000000"/>
+                <w:sz w:val="18"/>
+              </w:rPr>
+              <w:t>真实取实测 展示取逐轮估计 无日志不补</w:t>
+            </w:r>
+          </w:p>
+        </w:tc>
+      </w:tr>
+      <w:tr>
+        <w:trPr>
+          <w:cantSplit/>
+        </w:trPr>
+        <w:tc>
+          <w:tcPr>
+            <w:tcW w:type="dxa" w:w="2835"/>
+            <w:vAlign w:val="center"/>
+            <w:tcMar>
+              <w:top w:w="85" w:type="dxa"/>
+              <w:bottom w:w="85" w:type="dxa"/>
+              <w:left w:w="110" w:type="dxa"/>
+              <w:right w:w="110" w:type="dxa"/>
+            </w:tcMar>
+            <w:shd w:fill="FFFFFF"/>
+          </w:tcPr>
+          <w:p>
+            <w:pPr>
+              <w:keepNext w:val="0"/>
+              <w:spacing w:after="0" w:before="0" w:line="271" w:lineRule="auto"/>
+            </w:pPr>
+            <w:r>
+              <w:rPr>
+                <w:rFonts w:ascii="Arial" w:hAnsi="Arial" w:eastAsia="Songti SC"/>
+                <w:b w:val="0"/>
+                <w:color w:val="000000"/>
+                <w:sz w:val="18"/>
+              </w:rPr>
+              <w:t>reply_time_source 等</w:t>
+            </w:r>
+          </w:p>
+        </w:tc>
+        <w:tc>
+          <w:tcPr>
+            <w:tcW w:type="dxa" w:w="3118"/>
+            <w:vAlign w:val="center"/>
+            <w:tcMar>
+              <w:top w:w="85" w:type="dxa"/>
+              <w:bottom w:w="85" w:type="dxa"/>
+              <w:left w:w="110" w:type="dxa"/>
+              <w:right w:w="110" w:type="dxa"/>
+            </w:tcMar>
+            <w:shd w:fill="FFFFFF"/>
+          </w:tcPr>
+          <w:p>
+            <w:pPr>
+              <w:keepNext w:val="0"/>
+              <w:spacing w:after="0" w:before="0" w:line="271" w:lineRule="auto"/>
+            </w:pPr>
+            <w:r>
+              <w:rPr>
+                <w:rFonts w:ascii="Arial" w:hAnsi="Arial" w:eastAsia="Songti SC"/>
+                <w:b w:val="0"/>
+                <w:color w:val="000000"/>
+                <w:sz w:val="18"/>
+              </w:rPr>
+              <w:t>耗时来源 样本数与估计器版本</w:t>
+            </w:r>
+          </w:p>
+        </w:tc>
+        <w:tc>
+          <w:tcPr>
+            <w:tcW w:type="dxa" w:w="3288"/>
+            <w:vAlign w:val="center"/>
+            <w:tcMar>
+              <w:top w:w="85" w:type="dxa"/>
+              <w:bottom w:w="85" w:type="dxa"/>
+              <w:left w:w="110" w:type="dxa"/>
+              <w:right w:w="110" w:type="dxa"/>
+            </w:tcMar>
+            <w:shd w:fill="FFFFFF"/>
+          </w:tcPr>
+          <w:p>
+            <w:pPr>
+              <w:keepNext w:val="0"/>
+              <w:spacing w:after="0" w:before="0" w:line="271" w:lineRule="auto"/>
+            </w:pPr>
+            <w:r>
+              <w:rPr>
+                <w:rFonts w:ascii="Arial" w:hAnsi="Arial" w:eastAsia="Songti SC"/>
+                <w:b w:val="0"/>
+                <w:color w:val="000000"/>
+                <w:sz w:val="18"/>
+              </w:rPr>
+              <w:t>记录JSON存来源／版本 逐轮依据见归档</w:t>
             </w:r>
           </w:p>
         </w:tc>

</xml_diff>